<commit_message>
Deploy preview for PR 56 🛫
</commit_message>
<xml_diff>
--- a/pr-preview/pr-56/Your-Book-Title-tracked-changes.docx
+++ b/pr-preview/pr-56/Your-Book-Title-tracked-changes.docx
@@ -22,9 +22,11 @@
       <w:pPr>
         <w:pStyle w:val="Date"/>
       </w:pPr>
-      <w:r>
-        <w:t xml:space="preserve">Last updated: 2026-09-14</w:t>
-      </w:r>
+      <w:ins w:id="2" w:author="d-morrison" w:date="2026-09-15T00:11:05Z">
+        <w:r>
+          <w:t xml:space="preserve">Last updated: 2026-09-15</w:t>
+        </w:r>
+      </w:ins>
     </w:p>
     <w:bookmarkStart w:id="15" w:name="welcome"/>
     <w:p>
@@ -2232,7 +2234,7 @@
           <w:numId w:val="1004"/>
         </w:numPr>
       </w:pPr>
-      <w:ins w:id="79" w:author="d-morrison" w:date="2026-09-14T23:22:28Z">
+      <w:ins w:id="79" w:author="d-morrison" w:date="2026-09-15T00:11:05Z">
         <w:r>
           <w:rPr>
             <w:b/>
@@ -2241,12 +2243,12 @@
           <w:t xml:space="preserve">Branch:</w:t>
         </w:r>
       </w:ins>
-      <w:ins w:id="79" w:author="d-morrison" w:date="2026-09-14T23:22:28Z">
+      <w:ins w:id="79" w:author="d-morrison" w:date="2026-09-15T00:11:05Z">
         <w:r>
           <w:t xml:space="preserve"> </w:t>
         </w:r>
       </w:ins>
-      <w:ins w:id="79" w:author="d-morrison" w:date="2026-09-14T23:22:28Z">
+      <w:ins w:id="79" w:author="d-morrison" w:date="2026-09-15T00:11:05Z">
         <w:r>
           <w:t xml:space="preserve">claude/friendly-meitner-dv3jm1</w:t>
         </w:r>
@@ -2260,7 +2262,7 @@
           <w:numId w:val="1004"/>
         </w:numPr>
       </w:pPr>
-      <w:ins w:id="80" w:author="d-morrison" w:date="2026-09-14T23:22:28Z">
+      <w:ins w:id="80" w:author="d-morrison" w:date="2026-09-15T00:11:05Z">
         <w:r>
           <w:rPr>
             <w:b/>
@@ -2269,14 +2271,14 @@
           <w:t xml:space="preserve">Commit:</w:t>
         </w:r>
       </w:ins>
-      <w:ins w:id="80" w:author="d-morrison" w:date="2026-09-14T23:22:28Z">
+      <w:ins w:id="80" w:author="d-morrison" w:date="2026-09-15T00:11:05Z">
         <w:r>
           <w:t xml:space="preserve"> </w:t>
         </w:r>
       </w:ins>
-      <w:ins w:id="80" w:author="d-morrison" w:date="2026-09-14T23:22:28Z">
+      <w:ins w:id="80" w:author="d-morrison" w:date="2026-09-15T00:11:05Z">
         <w:r>
-          <w:t xml:space="preserve">fa56b16</w:t>
+          <w:t xml:space="preserve">b60ce3f</w:t>
         </w:r>
       </w:ins>
     </w:p>
@@ -2288,7 +2290,7 @@
           <w:numId w:val="1004"/>
         </w:numPr>
       </w:pPr>
-      <w:ins w:id="81" w:author="d-morrison" w:date="2026-09-14T23:22:28Z">
+      <w:ins w:id="81" w:author="d-morrison" w:date="2026-09-15T00:11:05Z">
         <w:r>
           <w:rPr>
             <w:b/>
@@ -2297,14 +2299,14 @@
           <w:t xml:space="preserve">Full commit hash:</w:t>
         </w:r>
       </w:ins>
-      <w:ins w:id="81" w:author="d-morrison" w:date="2026-09-14T23:22:28Z">
+      <w:ins w:id="81" w:author="d-morrison" w:date="2026-09-15T00:11:05Z">
         <w:r>
           <w:t xml:space="preserve"> </w:t>
         </w:r>
       </w:ins>
-      <w:ins w:id="81" w:author="d-morrison" w:date="2026-09-14T23:22:28Z">
+      <w:ins w:id="81" w:author="d-morrison" w:date="2026-09-15T00:11:05Z">
         <w:r>
-          <w:t xml:space="preserve">fa56b168a060703a9380cf1b8cc7ff3c9c6a2382</w:t>
+          <w:t xml:space="preserve">b60ce3f0bb15c7bcd015483d8c91d899c82d2c29</w:t>
         </w:r>
       </w:ins>
     </w:p>
@@ -2316,7 +2318,7 @@
           <w:numId w:val="1004"/>
         </w:numPr>
       </w:pPr>
-      <w:ins w:id="82" w:author="d-morrison" w:date="2026-09-14T23:22:28Z">
+      <w:ins w:id="82" w:author="d-morrison" w:date="2026-09-15T00:11:05Z">
         <w:r>
           <w:rPr>
             <w:b/>
@@ -2325,14 +2327,14 @@
           <w:t xml:space="preserve">Commit date:</w:t>
         </w:r>
       </w:ins>
-      <w:ins w:id="82" w:author="d-morrison" w:date="2026-09-14T23:22:28Z">
+      <w:ins w:id="82" w:author="d-morrison" w:date="2026-09-15T00:11:05Z">
         <w:r>
           <w:t xml:space="preserve"> </w:t>
         </w:r>
       </w:ins>
-      <w:ins w:id="82" w:author="d-morrison" w:date="2026-09-14T23:22:28Z">
+      <w:ins w:id="82" w:author="d-morrison" w:date="2026-09-15T00:11:05Z">
         <w:r>
-          <w:t xml:space="preserve">2026-09-14 16:20:08 -0700</w:t>
+          <w:t xml:space="preserve">2026-09-15 00:08:22 +0000</w:t>
         </w:r>
       </w:ins>
     </w:p>

</xml_diff>